<commit_message>
세션 61: 면담자료 Ver5.1 — 예비심사 10/22 18:00
Co-Authored-By: Claude Fable 5.1 <noreply@anthropic.com>
Claude-Session: https://claude.ai/code/session_01EaVr1DkQHxTofHRVwE7Jkc
</commit_message>
<xml_diff>
--- a/s61/면담자료/면담자료_20261012_Ver5.1.docx
+++ b/s61/면담자료/면담자료_20261012_Ver5.1.docx
@@ -7479,7 +7479,7 @@
           <w:sz w:val="19"/>
           <w:szCs w:val="19"/>
         </w:rPr>
-        <w:t xml:space="preserve">심사위원 5인(위원장·부위원장 포함)과 세 차례 심사일은 확정되었습니다. 예비심사 시간·장소는 확정되는 대로 채우겠습니다.</w:t>
+        <w:t xml:space="preserve">심사위원 5인(위원장·부위원장 포함)과 세 차례 심사 일시는 확정되었습니다. 장소는 확정되는 대로 채우겠습니다.</w:t>
       </w:r>
     </w:p>
     <w:tbl>
@@ -8288,7 +8288,7 @@
                 <w:sz w:val="18"/>
                 <w:szCs w:val="18"/>
               </w:rPr>
-              <w:t xml:space="preserve">2026년 10월 22일(목)</w:t>
+              <w:t xml:space="preserve">2026년 10월 22일(목) 18:00</w:t>
             </w:r>
           </w:p>
         </w:tc>
@@ -8320,7 +8320,7 @@
                 <w:sz w:val="18"/>
                 <w:szCs w:val="18"/>
               </w:rPr>
-              <w:t xml:space="preserve">시간·장소 미정 → 확정 뒤 기재. 발표 약 30분 분량 준비(시간이 20분이면 축소)</w:t>
+              <w:t xml:space="preserve">장소는 확정 뒤 기재. 발표 약 30분 분량 준비(시간이 20분이면 축소)</w:t>
             </w:r>
           </w:p>
         </w:tc>

</xml_diff>